<commit_message>
Update CV: ATS-optimized phone, full LinkedIn URL, and Project Experience heading
</commit_message>
<xml_diff>
--- a/assets/MANAR_SALAH_CV_New.docx
+++ b/assets/MANAR_SALAH_CV_New.docx
@@ -57,7 +57,7 @@
             <w:color w:val="000000"/>
             <w:sz w:val="18"/>
           </w:rPr>
-          <w:t>+201109057028</w:t>
+          <w:t>01109057028</w:t>
         </w:r>
       </w:hyperlink>
       <w:r>
@@ -74,35 +74,35 @@
         </w:rPr>
         <w:t>Cairo, Egypt</w:t>
       </w:r>
-      <w:r>
-        <w:rPr>
-          <w:sz w:val="18"/>
-          <w:color w:val="000000"/>
-        </w:rPr>
-        <w:t xml:space="preserve">   |   </w:t>
-      </w:r>
+    </w:p>
+    <w:p>
+      <w:pPr>
+        <w:jc w:val="center"/>
+        <w:spacing w:after="140"/>
+      </w:pPr>
       <w:hyperlink xmlns:r="http://schemas.openxmlformats.org/officeDocument/2006/relationships" r:id="rIdLink3">
         <w:r>
           <w:rPr>
             <w:color w:val="000000"/>
             <w:sz w:val="18"/>
           </w:rPr>
-          <w:t>LinkedIn</w:t>
+          <w:t>linkedin.com/in/manar-salah-8125052ab</w:t>
         </w:r>
       </w:hyperlink>
-    </w:p>
-    <w:p>
-      <w:pPr>
-        <w:jc w:val="center"/>
-        <w:spacing w:after="140"/>
-      </w:pPr>
+      <w:r>
+        <w:rPr>
+          <w:sz w:val="18"/>
+          <w:color w:val="000000"/>
+        </w:rPr>
+        <w:t xml:space="preserve">   |   </w:t>
+      </w:r>
       <w:hyperlink xmlns:r="http://schemas.openxmlformats.org/officeDocument/2006/relationships" r:id="rIdLink4">
         <w:r>
           <w:rPr>
             <w:color w:val="000000"/>
             <w:sz w:val="18"/>
           </w:rPr>
-          <w:t>GitHub</w:t>
+          <w:t>github.com/manar42</w:t>
         </w:r>
       </w:hyperlink>
       <w:r>
@@ -174,7 +174,7 @@
           <w:sz w:val="22"/>
           <w:caps/>
         </w:rPr>
-        <w:t>Projects</w:t>
+        <w:t>Project Experience</w:t>
       </w:r>
     </w:p>
     <w:p>

</xml_diff>